<commit_message>
fix bugs and update new features
</commit_message>
<xml_diff>
--- a/backend/templates/letter_template.docx
+++ b/backend/templates/letter_template.docx
@@ -7,404 +7,689 @@
         <w:spacing w:after="0" w:line="276" w:lineRule="auto"/>
         <w:rPr>
           <w:rFonts w:ascii="Cambria" w:hAnsi="Cambria"/>
-        </w:rPr>
-      </w:pPr>
-    </w:p>
-    <w:p>
-      <w:pPr>
-        <w:spacing w:after="0" w:line="276" w:lineRule="auto"/>
-        <w:rPr>
-          <w:rFonts w:ascii="Cambria" w:hAnsi="Cambria"/>
-        </w:rPr>
-      </w:pPr>
-      <w:r>
-        <w:rPr>
-          <w:rFonts w:ascii="Cambria" w:hAnsi="Cambria"/>
-          <w:b/>
-          <w:bCs/>
-        </w:rPr>
-        <w:t>[Your Name]</w:t>
+          <w:b/>
+          <w:bCs/>
+        </w:rPr>
+      </w:pPr>
+      <w:r>
+        <w:rPr>
+          <w:rFonts w:ascii="Cambria" w:hAnsi="Cambria"/>
+          <w:b/>
+          <w:bCs/>
+        </w:rPr>
+        <w:t>OFFICE OF THE OIC - CAMPUS COORDINATOR</w:t>
+      </w:r>
+    </w:p>
+    <w:p>
+      <w:pPr>
+        <w:spacing w:after="0" w:line="276" w:lineRule="auto"/>
+        <w:rPr>
+          <w:rFonts w:ascii="Cambria" w:hAnsi="Cambria"/>
+          <w:b/>
+          <w:bCs/>
+        </w:rPr>
+      </w:pPr>
+      <w:r>
+        <w:rPr>
+          <w:rFonts w:ascii="Cambria" w:hAnsi="Cambria"/>
+          <w:b/>
+          <w:bCs/>
+        </w:rPr>
+        <w:t>Memo No. 001, s. 2026</w:t>
+      </w:r>
+    </w:p>
+    <w:p>
+      <w:pPr>
+        <w:spacing w:after="0" w:line="276" w:lineRule="auto"/>
+        <w:rPr>
+          <w:rFonts w:ascii="Cambria" w:hAnsi="Cambria"/>
+          <w:b/>
+          <w:bCs/>
+        </w:rPr>
+      </w:pPr>
+    </w:p>
+    <w:p>
+      <w:pPr>
+        <w:spacing w:after="0" w:line="276" w:lineRule="auto"/>
+        <w:rPr>
+          <w:rFonts w:ascii="Cambria" w:hAnsi="Cambria"/>
+          <w:b/>
+          <w:bCs/>
+        </w:rPr>
+      </w:pPr>
+      <w:r>
+        <w:rPr>
+          <w:rFonts w:ascii="Cambria" w:hAnsi="Cambria"/>
+          <w:b/>
+          <w:bCs/>
+        </w:rPr>
+        <w:t>FOR</w:t>
+      </w:r>
+      <w:r>
+        <w:rPr>
+          <w:rFonts w:ascii="Cambria" w:hAnsi="Cambria"/>
+          <w:b/>
+          <w:bCs/>
+        </w:rPr>
+        <w:tab/>
+      </w:r>
+      <w:r>
+        <w:rPr>
+          <w:rFonts w:ascii="Cambria" w:hAnsi="Cambria"/>
+          <w:b/>
+          <w:bCs/>
+        </w:rPr>
+        <w:tab/>
+        <w:t>:</w:t>
+      </w:r>
+      <w:r>
+        <w:rPr>
+          <w:rFonts w:ascii="Cambria" w:hAnsi="Cambria"/>
+          <w:b/>
+          <w:bCs/>
+        </w:rPr>
+        <w:tab/>
+        <w:t>NAME</w:t>
+      </w:r>
+    </w:p>
+    <w:p>
+      <w:pPr>
+        <w:spacing w:after="0" w:line="276" w:lineRule="auto"/>
+        <w:rPr>
+          <w:rFonts w:ascii="Cambria" w:hAnsi="Cambria"/>
+        </w:rPr>
+      </w:pPr>
+      <w:r>
+        <w:rPr>
+          <w:rFonts w:ascii="Cambria" w:hAnsi="Cambria"/>
+          <w:b/>
+          <w:bCs/>
+        </w:rPr>
+        <w:tab/>
+      </w:r>
+      <w:r>
+        <w:rPr>
+          <w:rFonts w:ascii="Cambria" w:hAnsi="Cambria"/>
+          <w:b/>
+          <w:bCs/>
+        </w:rPr>
+        <w:tab/>
+      </w:r>
+      <w:r>
+        <w:rPr>
+          <w:rFonts w:ascii="Cambria" w:hAnsi="Cambria"/>
+          <w:b/>
+          <w:bCs/>
+        </w:rPr>
+        <w:tab/>
+      </w:r>
+      <w:r>
+        <w:rPr>
+          <w:rFonts w:ascii="Cambria" w:hAnsi="Cambria"/>
+        </w:rPr>
+        <w:t>Designation</w:t>
+      </w:r>
+    </w:p>
+    <w:p>
+      <w:pPr>
+        <w:spacing w:after="0" w:line="276" w:lineRule="auto"/>
+        <w:rPr>
+          <w:rFonts w:ascii="Cambria" w:hAnsi="Cambria"/>
+        </w:rPr>
+      </w:pPr>
+    </w:p>
+    <w:p>
+      <w:pPr>
+        <w:spacing w:after="0" w:line="276" w:lineRule="auto"/>
+        <w:rPr>
+          <w:rFonts w:ascii="Cambria" w:hAnsi="Cambria"/>
+          <w:b/>
+          <w:bCs/>
+        </w:rPr>
+      </w:pPr>
+      <w:r>
+        <w:rPr>
+          <w:rFonts w:ascii="Cambria" w:hAnsi="Cambria"/>
+          <w:b/>
+          <w:bCs/>
+        </w:rPr>
+        <w:t>THRU</w:t>
+      </w:r>
+      <w:r>
+        <w:rPr>
+          <w:rFonts w:ascii="Cambria" w:hAnsi="Cambria"/>
+          <w:b/>
+          <w:bCs/>
+        </w:rPr>
+        <w:tab/>
+      </w:r>
+      <w:r>
+        <w:rPr>
+          <w:rFonts w:ascii="Cambria" w:hAnsi="Cambria"/>
+          <w:b/>
+          <w:bCs/>
+        </w:rPr>
+        <w:tab/>
+        <w:t>:</w:t>
+      </w:r>
+      <w:r>
+        <w:rPr>
+          <w:rFonts w:ascii="Cambria" w:hAnsi="Cambria"/>
+          <w:b/>
+          <w:bCs/>
+        </w:rPr>
+        <w:tab/>
+        <w:t>NAME</w:t>
+      </w:r>
+    </w:p>
+    <w:p>
+      <w:pPr>
+        <w:spacing w:after="0" w:line="276" w:lineRule="auto"/>
+        <w:rPr>
+          <w:rFonts w:ascii="Cambria" w:hAnsi="Cambria"/>
+        </w:rPr>
+      </w:pPr>
+      <w:r>
+        <w:rPr>
+          <w:rFonts w:ascii="Cambria" w:hAnsi="Cambria"/>
+          <w:b/>
+          <w:bCs/>
+        </w:rPr>
+        <w:tab/>
+      </w:r>
+      <w:r>
+        <w:rPr>
+          <w:rFonts w:ascii="Cambria" w:hAnsi="Cambria"/>
+          <w:b/>
+          <w:bCs/>
+        </w:rPr>
+        <w:tab/>
+      </w:r>
+      <w:r>
+        <w:rPr>
+          <w:rFonts w:ascii="Cambria" w:hAnsi="Cambria"/>
+          <w:b/>
+          <w:bCs/>
+        </w:rPr>
+        <w:tab/>
+      </w:r>
+      <w:r>
+        <w:rPr>
+          <w:rFonts w:ascii="Cambria" w:hAnsi="Cambria"/>
+        </w:rPr>
+        <w:t>Designation</w:t>
+      </w:r>
+    </w:p>
+    <w:p>
+      <w:pPr>
+        <w:spacing w:after="0" w:line="276" w:lineRule="auto"/>
+        <w:rPr>
+          <w:rFonts w:ascii="Cambria" w:hAnsi="Cambria"/>
+          <w:b/>
+          <w:bCs/>
+        </w:rPr>
+      </w:pPr>
+    </w:p>
+    <w:p>
+      <w:pPr>
+        <w:spacing w:after="0" w:line="276" w:lineRule="auto"/>
+        <w:rPr>
+          <w:rFonts w:ascii="Cambria" w:hAnsi="Cambria"/>
+          <w:b/>
+          <w:bCs/>
+        </w:rPr>
+      </w:pPr>
+      <w:r>
+        <w:rPr>
+          <w:rFonts w:ascii="Cambria" w:hAnsi="Cambria"/>
+          <w:b/>
+          <w:bCs/>
+        </w:rPr>
+        <w:t>FROM</w:t>
+      </w:r>
+      <w:r>
+        <w:rPr>
+          <w:rFonts w:ascii="Cambria" w:hAnsi="Cambria"/>
+          <w:b/>
+          <w:bCs/>
+        </w:rPr>
+        <w:tab/>
+      </w:r>
+      <w:r>
+        <w:rPr>
+          <w:rFonts w:ascii="Cambria" w:hAnsi="Cambria"/>
+          <w:b/>
+          <w:bCs/>
+        </w:rPr>
+        <w:tab/>
+        <w:t>:</w:t>
+      </w:r>
+      <w:r>
+        <w:rPr>
+          <w:rFonts w:ascii="Cambria" w:hAnsi="Cambria"/>
+          <w:b/>
+          <w:bCs/>
+        </w:rPr>
+        <w:tab/>
+        <w:t>NAME</w:t>
+      </w:r>
+    </w:p>
+    <w:p>
+      <w:pPr>
+        <w:spacing w:after="0" w:line="276" w:lineRule="auto"/>
+        <w:rPr>
+          <w:rFonts w:ascii="Cambria" w:hAnsi="Cambria"/>
+        </w:rPr>
+      </w:pPr>
+      <w:r>
+        <w:rPr>
+          <w:rFonts w:ascii="Cambria" w:hAnsi="Cambria"/>
+          <w:b/>
+          <w:bCs/>
+        </w:rPr>
+        <w:tab/>
+      </w:r>
+      <w:r>
+        <w:rPr>
+          <w:rFonts w:ascii="Cambria" w:hAnsi="Cambria"/>
+          <w:b/>
+          <w:bCs/>
+        </w:rPr>
+        <w:tab/>
+      </w:r>
+      <w:r>
+        <w:rPr>
+          <w:rFonts w:ascii="Cambria" w:hAnsi="Cambria"/>
+          <w:b/>
+          <w:bCs/>
+        </w:rPr>
+        <w:tab/>
+      </w:r>
+      <w:r>
+        <w:rPr>
+          <w:rFonts w:ascii="Cambria" w:hAnsi="Cambria"/>
+        </w:rPr>
+        <w:t>Designation</w:t>
+      </w:r>
+    </w:p>
+    <w:p>
+      <w:pPr>
+        <w:spacing w:after="0" w:line="276" w:lineRule="auto"/>
+        <w:rPr>
+          <w:rFonts w:ascii="Cambria" w:hAnsi="Cambria"/>
+          <w:b/>
+          <w:bCs/>
+        </w:rPr>
+      </w:pPr>
+    </w:p>
+    <w:p>
+      <w:pPr>
+        <w:spacing w:after="0" w:line="276" w:lineRule="auto"/>
+        <w:rPr>
+          <w:rFonts w:ascii="Cambria" w:hAnsi="Cambria"/>
+          <w:b/>
+          <w:bCs/>
+        </w:rPr>
+      </w:pPr>
+      <w:r>
+        <w:rPr>
+          <w:rFonts w:ascii="Cambria" w:hAnsi="Cambria"/>
+          <w:b/>
+          <w:bCs/>
+        </w:rPr>
+        <w:t>SUBJECT</w:t>
+      </w:r>
+      <w:r>
+        <w:rPr>
+          <w:rFonts w:ascii="Cambria" w:hAnsi="Cambria"/>
+          <w:b/>
+          <w:bCs/>
+        </w:rPr>
+        <w:tab/>
+        <w:t>:</w:t>
+      </w:r>
+      <w:r>
+        <w:rPr>
+          <w:rFonts w:ascii="Cambria" w:hAnsi="Cambria"/>
+          <w:b/>
+          <w:bCs/>
+        </w:rPr>
+        <w:tab/>
+        <w:t>SUBJECT TITLE</w:t>
+      </w:r>
+    </w:p>
+    <w:p>
+      <w:pPr>
+        <w:spacing w:after="0" w:line="276" w:lineRule="auto"/>
+        <w:rPr>
+          <w:rFonts w:ascii="Cambria" w:hAnsi="Cambria"/>
+          <w:b/>
+          <w:bCs/>
+        </w:rPr>
+      </w:pPr>
+    </w:p>
+    <w:p>
+      <w:pPr>
+        <w:spacing w:after="0" w:line="276" w:lineRule="auto"/>
+        <w:rPr>
+          <w:rFonts w:ascii="Cambria" w:hAnsi="Cambria"/>
+          <w:b/>
+          <w:bCs/>
+        </w:rPr>
+      </w:pPr>
+      <w:r>
+        <w:rPr>
+          <w:rFonts w:ascii="Cambria" w:hAnsi="Cambria"/>
+          <w:b/>
+          <w:bCs/>
+        </w:rPr>
+        <w:t>DATE</w:t>
+      </w:r>
+      <w:r>
+        <w:rPr>
+          <w:rFonts w:ascii="Cambria" w:hAnsi="Cambria"/>
+          <w:b/>
+          <w:bCs/>
+        </w:rPr>
+        <w:tab/>
+      </w:r>
+      <w:r>
+        <w:rPr>
+          <w:rFonts w:ascii="Cambria" w:hAnsi="Cambria"/>
+          <w:b/>
+          <w:bCs/>
+        </w:rPr>
+        <w:tab/>
+        <w:t xml:space="preserve">: </w:t>
+      </w:r>
+      <w:r>
+        <w:rPr>
+          <w:rFonts w:ascii="Cambria" w:hAnsi="Cambria"/>
+          <w:b/>
+          <w:bCs/>
+        </w:rPr>
+        <w:tab/>
+        <w:t>DATE</w:t>
+      </w:r>
+    </w:p>
+    <w:p>
+      <w:pPr>
+        <w:spacing w:after="0" w:line="276" w:lineRule="auto"/>
+        <w:rPr>
+          <w:rFonts w:ascii="Cambria" w:hAnsi="Cambria"/>
+          <w:b/>
+          <w:bCs/>
+        </w:rPr>
+      </w:pPr>
+    </w:p>
+    <w:p>
+      <w:pPr>
+        <w:spacing w:after="0" w:line="276" w:lineRule="auto"/>
+        <w:rPr>
+          <w:rFonts w:ascii="Cambria" w:hAnsi="Cambria"/>
+          <w:b/>
+          <w:bCs/>
+        </w:rPr>
+      </w:pPr>
+    </w:p>
+    <w:p>
+      <w:pPr>
+        <w:spacing w:after="0" w:line="276" w:lineRule="auto"/>
+        <w:rPr>
+          <w:rFonts w:ascii="Cambria" w:hAnsi="Cambria"/>
+        </w:rPr>
+      </w:pPr>
+      <w:r>
+        <w:rPr>
+          <w:rFonts w:ascii="Cambria" w:hAnsi="Cambria"/>
+        </w:rPr>
+        <w:t xml:space="preserve">This Memorandum Order is issued to [state the reason or objective briefly]. It aims to [explain the intended outcome or </w:t>
+      </w:r>
+      <w:proofErr w:type="gramStart"/>
+      <w:r>
+        <w:rPr>
+          <w:rFonts w:ascii="Cambria" w:hAnsi="Cambria"/>
+        </w:rPr>
+        <w:t>goal].</w:t>
+      </w:r>
+      <w:proofErr w:type="gramEnd"/>
+    </w:p>
+    <w:p>
+      <w:pPr>
+        <w:spacing w:after="0" w:line="276" w:lineRule="auto"/>
+        <w:rPr>
+          <w:rFonts w:ascii="Cambria" w:hAnsi="Cambria"/>
+        </w:rPr>
+      </w:pPr>
+    </w:p>
+    <w:p>
+      <w:pPr>
+        <w:spacing w:after="0" w:line="276" w:lineRule="auto"/>
+        <w:rPr>
+          <w:rFonts w:ascii="Cambria" w:hAnsi="Cambria"/>
+        </w:rPr>
+      </w:pPr>
+      <w:r>
+        <w:rPr>
+          <w:rFonts w:ascii="Cambria" w:hAnsi="Cambria"/>
+        </w:rPr>
+        <w:t>This Order shall apply to [specific offices, departments, or personnel involved].</w:t>
+      </w:r>
+    </w:p>
+    <w:p>
+      <w:pPr>
+        <w:spacing w:after="0" w:line="276" w:lineRule="auto"/>
+        <w:rPr>
+          <w:rFonts w:ascii="Cambria" w:hAnsi="Cambria"/>
+        </w:rPr>
+      </w:pPr>
+    </w:p>
+    <w:p>
+      <w:pPr>
+        <w:spacing w:after="0" w:line="276" w:lineRule="auto"/>
+        <w:rPr>
+          <w:rFonts w:ascii="Cambria" w:hAnsi="Cambria"/>
+        </w:rPr>
+      </w:pPr>
+      <w:r>
+        <w:rPr>
+          <w:rFonts w:ascii="Cambria" w:hAnsi="Cambria"/>
+        </w:rPr>
+        <w:t>In line with this, the following instructions are hereby issued:</w:t>
+      </w:r>
+    </w:p>
+    <w:p>
+      <w:pPr>
+        <w:spacing w:after="0" w:line="276" w:lineRule="auto"/>
+        <w:rPr>
+          <w:rFonts w:ascii="Cambria" w:hAnsi="Cambria"/>
+        </w:rPr>
+      </w:pPr>
+      <w:r>
+        <w:rPr>
+          <w:rFonts w:ascii="Cambria" w:hAnsi="Cambria"/>
+        </w:rPr>
+        <w:t>1 [First instruction – clear and specific]</w:t>
       </w:r>
       <w:r>
         <w:rPr>
           <w:rFonts w:ascii="Cambria" w:hAnsi="Cambria"/>
         </w:rPr>
         <w:br/>
-        <w:t>[Your Address]</w:t>
+        <w:t>2 [Second instruction]</w:t>
       </w:r>
       <w:r>
         <w:rPr>
           <w:rFonts w:ascii="Cambria" w:hAnsi="Cambria"/>
         </w:rPr>
         <w:br/>
-        <w:t>[City, Province, ZIP Code]</w:t>
+        <w:t>3 [Third instruction]</w:t>
+      </w:r>
+    </w:p>
+    <w:p>
+      <w:pPr>
+        <w:spacing w:after="0" w:line="276" w:lineRule="auto"/>
+        <w:rPr>
+          <w:rFonts w:ascii="Cambria" w:hAnsi="Cambria"/>
+        </w:rPr>
+      </w:pPr>
+    </w:p>
+    <w:p>
+      <w:pPr>
+        <w:spacing w:after="0" w:line="276" w:lineRule="auto"/>
+        <w:rPr>
+          <w:rFonts w:ascii="Cambria" w:hAnsi="Cambria"/>
+        </w:rPr>
+      </w:pPr>
+      <w:r>
+        <w:rPr>
+          <w:rFonts w:ascii="Cambria" w:hAnsi="Cambria"/>
+        </w:rPr>
+        <w:t xml:space="preserve">All concerned are directed to comply with the above </w:t>
+      </w:r>
+      <w:proofErr w:type="gramStart"/>
+      <w:r>
+        <w:rPr>
+          <w:rFonts w:ascii="Cambria" w:hAnsi="Cambria"/>
+        </w:rPr>
+        <w:t>instructions</w:t>
+      </w:r>
+      <w:proofErr w:type="gramEnd"/>
+      <w:r>
+        <w:rPr>
+          <w:rFonts w:ascii="Cambria" w:hAnsi="Cambria"/>
+        </w:rPr>
+        <w:t xml:space="preserve"> effective [date]. The [office/person] shall be responsible for monitoring and ensuring proper implementation.</w:t>
+      </w:r>
+    </w:p>
+    <w:p>
+      <w:pPr>
+        <w:spacing w:after="0" w:line="276" w:lineRule="auto"/>
+        <w:rPr>
+          <w:rFonts w:ascii="Cambria" w:hAnsi="Cambria"/>
+        </w:rPr>
+      </w:pPr>
+    </w:p>
+    <w:p>
+      <w:pPr>
+        <w:spacing w:after="0" w:line="276" w:lineRule="auto"/>
+        <w:rPr>
+          <w:rFonts w:ascii="Cambria" w:hAnsi="Cambria"/>
+        </w:rPr>
+      </w:pPr>
+      <w:r>
+        <w:rPr>
+          <w:rFonts w:ascii="Cambria" w:hAnsi="Cambria"/>
+        </w:rPr>
+        <w:t>This Memorandum Order shall take effect immediately upon issuance (or specify date).</w:t>
+      </w:r>
+    </w:p>
+    <w:p>
+      <w:pPr>
+        <w:spacing w:after="0" w:line="276" w:lineRule="auto"/>
+        <w:rPr>
+          <w:rFonts w:ascii="Cambria" w:hAnsi="Cambria"/>
+        </w:rPr>
+      </w:pPr>
+    </w:p>
+    <w:p>
+      <w:pPr>
+        <w:spacing w:after="0" w:line="276" w:lineRule="auto"/>
+        <w:rPr>
+          <w:rFonts w:ascii="Cambria" w:hAnsi="Cambria"/>
+          <w:b/>
+          <w:bCs/>
+        </w:rPr>
+      </w:pPr>
+      <w:r>
+        <w:rPr>
+          <w:rFonts w:ascii="Cambria" w:hAnsi="Cambria"/>
+        </w:rPr>
+        <w:t>Issued this [day] of [month, year] at [place].</w:t>
+      </w:r>
+    </w:p>
+    <w:p>
+      <w:pPr>
+        <w:spacing w:after="0" w:line="276" w:lineRule="auto"/>
+        <w:rPr>
+          <w:rFonts w:ascii="Cambria" w:hAnsi="Cambria"/>
+          <w:b/>
+          <w:bCs/>
+        </w:rPr>
+      </w:pPr>
+    </w:p>
+    <w:p>
+      <w:pPr>
+        <w:spacing w:after="0" w:line="276" w:lineRule="auto"/>
+        <w:rPr>
+          <w:rFonts w:ascii="Cambria" w:hAnsi="Cambria"/>
+          <w:b/>
+          <w:bCs/>
+        </w:rPr>
+      </w:pPr>
+    </w:p>
+    <w:p>
+      <w:pPr>
+        <w:spacing w:after="0" w:line="276" w:lineRule="auto"/>
+        <w:rPr>
+          <w:rFonts w:ascii="Cambria" w:hAnsi="Cambria"/>
+          <w:b/>
+          <w:bCs/>
+        </w:rPr>
+      </w:pPr>
+    </w:p>
+    <w:p>
+      <w:pPr>
+        <w:spacing w:after="0" w:line="276" w:lineRule="auto"/>
+        <w:rPr>
+          <w:rFonts w:ascii="Cambria" w:hAnsi="Cambria"/>
+          <w:b/>
+          <w:bCs/>
+        </w:rPr>
+      </w:pPr>
+      <w:r>
+        <w:rPr>
+          <w:rFonts w:ascii="Cambria" w:hAnsi="Cambria"/>
+        </w:rPr>
+        <w:t>[Signature]</w:t>
       </w:r>
       <w:r>
         <w:rPr>
           <w:rFonts w:ascii="Cambria" w:hAnsi="Cambria"/>
         </w:rPr>
         <w:br/>
-        <w:t>[Email Address]</w:t>
+      </w:r>
+      <w:r>
+        <w:rPr>
+          <w:rFonts w:ascii="Cambria" w:hAnsi="Cambria"/>
+          <w:b/>
+          <w:bCs/>
+        </w:rPr>
+        <w:t>NAME</w:t>
       </w:r>
       <w:r>
         <w:rPr>
           <w:rFonts w:ascii="Cambria" w:hAnsi="Cambria"/>
         </w:rPr>
         <w:br/>
-        <w:t>[Phone Number]</w:t>
-      </w:r>
-    </w:p>
-    <w:p>
-      <w:pPr>
-        <w:spacing w:after="0" w:line="276" w:lineRule="auto"/>
-        <w:rPr>
-          <w:rFonts w:ascii="Cambria" w:hAnsi="Cambria"/>
-        </w:rPr>
-      </w:pPr>
-    </w:p>
-    <w:p>
-      <w:pPr>
-        <w:spacing w:after="0" w:line="276" w:lineRule="auto"/>
-        <w:rPr>
-          <w:rFonts w:ascii="Cambria" w:hAnsi="Cambria"/>
-          <w:b/>
-          <w:bCs/>
-        </w:rPr>
-      </w:pPr>
-      <w:r>
-        <w:rPr>
-          <w:rFonts w:ascii="Cambria" w:hAnsi="Cambria"/>
-          <w:b/>
-          <w:bCs/>
-        </w:rPr>
-        <w:t>[Date]</w:t>
-      </w:r>
-    </w:p>
-    <w:p>
-      <w:pPr>
-        <w:spacing w:after="0" w:line="276" w:lineRule="auto"/>
-        <w:rPr>
-          <w:rFonts w:ascii="Cambria" w:hAnsi="Cambria"/>
-          <w:b/>
-          <w:bCs/>
-        </w:rPr>
-      </w:pPr>
-    </w:p>
-    <w:p>
-      <w:pPr>
-        <w:spacing w:after="0" w:line="276" w:lineRule="auto"/>
-        <w:rPr>
-          <w:rFonts w:ascii="Cambria" w:hAnsi="Cambria"/>
-        </w:rPr>
-      </w:pPr>
-      <w:r>
-        <w:rPr>
-          <w:rFonts w:ascii="Cambria" w:hAnsi="Cambria"/>
-          <w:b/>
-          <w:bCs/>
-        </w:rPr>
-        <w:t>[Recipient Name]</w:t>
-      </w:r>
-      <w:r>
-        <w:rPr>
-          <w:rFonts w:ascii="Cambria" w:hAnsi="Cambria"/>
-        </w:rPr>
-        <w:br/>
-        <w:t>[Recipient Position]</w:t>
-      </w:r>
-      <w:r>
-        <w:rPr>
-          <w:rFonts w:ascii="Cambria" w:hAnsi="Cambria"/>
-        </w:rPr>
-        <w:br/>
-        <w:t>[Company/Organization Name]</w:t>
-      </w:r>
-      <w:r>
-        <w:rPr>
-          <w:rFonts w:ascii="Cambria" w:hAnsi="Cambria"/>
-        </w:rPr>
-        <w:br/>
-        <w:t>[Company Address]</w:t>
-      </w:r>
-      <w:r>
-        <w:rPr>
-          <w:rFonts w:ascii="Cambria" w:hAnsi="Cambria"/>
-        </w:rPr>
-        <w:br/>
-        <w:t>[City, Province, ZIP Code]</w:t>
-      </w:r>
-    </w:p>
-    <w:p>
-      <w:pPr>
-        <w:spacing w:after="0" w:line="276" w:lineRule="auto"/>
-        <w:rPr>
-          <w:rFonts w:ascii="Cambria" w:hAnsi="Cambria"/>
-        </w:rPr>
-      </w:pPr>
-    </w:p>
-    <w:p>
-      <w:pPr>
-        <w:spacing w:after="0" w:line="276" w:lineRule="auto"/>
-        <w:rPr>
-          <w:rFonts w:ascii="Cambria" w:hAnsi="Cambria"/>
-        </w:rPr>
-      </w:pPr>
-    </w:p>
-    <w:p>
-      <w:pPr>
-        <w:spacing w:after="0" w:line="276" w:lineRule="auto"/>
-        <w:rPr>
-          <w:rFonts w:ascii="Cambria" w:hAnsi="Cambria"/>
-        </w:rPr>
-      </w:pPr>
-      <w:r>
-        <w:rPr>
-          <w:rFonts w:ascii="Cambria" w:hAnsi="Cambria"/>
-        </w:rPr>
-        <w:t>Dear [Mr./Ms./Dr. Last Name],</w:t>
-      </w:r>
-    </w:p>
-    <w:p>
-      <w:pPr>
-        <w:spacing w:after="0" w:line="276" w:lineRule="auto"/>
-        <w:rPr>
-          <w:rFonts w:ascii="Cambria" w:hAnsi="Cambria"/>
-        </w:rPr>
-      </w:pPr>
-    </w:p>
-    <w:p>
-      <w:pPr>
-        <w:spacing w:after="0" w:line="276" w:lineRule="auto"/>
-        <w:rPr>
-          <w:rFonts w:ascii="Cambria" w:hAnsi="Cambria"/>
-        </w:rPr>
-      </w:pPr>
-      <w:r>
-        <w:rPr>
-          <w:rFonts w:ascii="Cambria" w:hAnsi="Cambria"/>
-        </w:rPr>
-        <w:t>I hope this letter finds you well.</w:t>
-      </w:r>
-    </w:p>
-    <w:p>
-      <w:pPr>
-        <w:spacing w:after="0" w:line="276" w:lineRule="auto"/>
-        <w:rPr>
-          <w:rFonts w:ascii="Cambria" w:hAnsi="Cambria"/>
-        </w:rPr>
-      </w:pPr>
-      <w:r>
-        <w:rPr>
-          <w:rFonts w:ascii="Cambria" w:hAnsi="Cambria"/>
-        </w:rPr>
-        <w:t>I am writing to [state the purpose of the letter clearly and briefly].</w:t>
-      </w:r>
-    </w:p>
-    <w:p>
-      <w:pPr>
-        <w:spacing w:after="0" w:line="276" w:lineRule="auto"/>
-        <w:rPr>
-          <w:rFonts w:ascii="Cambria" w:hAnsi="Cambria"/>
-        </w:rPr>
-      </w:pPr>
-    </w:p>
-    <w:p>
-      <w:pPr>
-        <w:spacing w:after="0" w:line="276" w:lineRule="auto"/>
-        <w:rPr>
-          <w:rFonts w:ascii="Cambria" w:hAnsi="Cambria"/>
-        </w:rPr>
-      </w:pPr>
-      <w:r>
-        <w:rPr>
-          <w:rFonts w:ascii="Cambria" w:hAnsi="Cambria"/>
-        </w:rPr>
-        <w:t>[Second paragraph: Add important details, explanation, request, or supporting information.]</w:t>
-      </w:r>
-    </w:p>
-    <w:p>
-      <w:pPr>
-        <w:spacing w:after="0" w:line="276" w:lineRule="auto"/>
-        <w:rPr>
-          <w:rFonts w:ascii="Cambria" w:hAnsi="Cambria"/>
-        </w:rPr>
-      </w:pPr>
-    </w:p>
-    <w:p>
-      <w:pPr>
-        <w:spacing w:after="0" w:line="276" w:lineRule="auto"/>
-        <w:rPr>
-          <w:rFonts w:ascii="Cambria" w:hAnsi="Cambria"/>
-        </w:rPr>
-      </w:pPr>
-      <w:r>
-        <w:rPr>
-          <w:rFonts w:ascii="Cambria" w:hAnsi="Cambria"/>
-        </w:rPr>
-        <w:t>[Third paragraph: Mention any next steps, appreciation, or closing remarks.]</w:t>
-      </w:r>
-    </w:p>
-    <w:p>
-      <w:pPr>
-        <w:spacing w:after="0" w:line="276" w:lineRule="auto"/>
-        <w:rPr>
-          <w:rFonts w:ascii="Cambria" w:hAnsi="Cambria"/>
-        </w:rPr>
-      </w:pPr>
-      <w:r>
-        <w:rPr>
-          <w:rFonts w:ascii="Cambria" w:hAnsi="Cambria"/>
-        </w:rPr>
-        <w:t>Thank you for your time and consideration. I look forward to your response.</w:t>
-      </w:r>
-    </w:p>
-    <w:p>
-      <w:pPr>
-        <w:spacing w:after="0" w:line="276" w:lineRule="auto"/>
-        <w:rPr>
-          <w:rFonts w:ascii="Cambria" w:hAnsi="Cambria"/>
-        </w:rPr>
-      </w:pPr>
-    </w:p>
-    <w:p>
-      <w:pPr>
-        <w:spacing w:after="0" w:line="276" w:lineRule="auto"/>
-        <w:rPr>
-          <w:rFonts w:ascii="Cambria" w:hAnsi="Cambria"/>
-        </w:rPr>
-      </w:pPr>
-    </w:p>
-    <w:p>
-      <w:pPr>
-        <w:spacing w:after="0" w:line="276" w:lineRule="auto"/>
-        <w:rPr>
-          <w:rFonts w:ascii="Cambria" w:hAnsi="Cambria"/>
-        </w:rPr>
-      </w:pPr>
-      <w:r>
-        <w:rPr>
-          <w:rFonts w:ascii="Cambria" w:hAnsi="Cambria"/>
-        </w:rPr>
-        <w:t>Sincerely,</w:t>
-      </w:r>
-    </w:p>
-    <w:p>
-      <w:pPr>
-        <w:spacing w:after="0" w:line="276" w:lineRule="auto"/>
-        <w:rPr>
-          <w:rFonts w:ascii="Cambria" w:hAnsi="Cambria"/>
-        </w:rPr>
-      </w:pPr>
-      <w:r>
-        <w:rPr>
-          <w:rFonts w:ascii="Cambria" w:hAnsi="Cambria"/>
-        </w:rPr>
-        <w:t>[Your Signature (if printed)]</w:t>
-      </w:r>
-      <w:r>
-        <w:rPr>
-          <w:rFonts w:ascii="Cambria" w:hAnsi="Cambria"/>
-        </w:rPr>
-        <w:br/>
-      </w:r>
-      <w:r>
-        <w:rPr>
-          <w:rFonts w:ascii="Cambria" w:hAnsi="Cambria"/>
-          <w:b/>
-          <w:bCs/>
-        </w:rPr>
-        <w:t>[YOUR FULL NAME]</w:t>
-      </w:r>
-    </w:p>
-    <w:p>
-      <w:pPr>
-        <w:spacing w:after="0" w:line="276" w:lineRule="auto"/>
-        <w:rPr>
-          <w:rFonts w:ascii="Cambria" w:hAnsi="Cambria"/>
-        </w:rPr>
-      </w:pPr>
-      <w:r>
-        <w:rPr>
-          <w:rFonts w:ascii="Cambria" w:hAnsi="Cambria"/>
-        </w:rPr>
-        <w:t>[Recipient Position]</w:t>
-      </w:r>
-    </w:p>
-    <w:p>
-      <w:pPr>
-        <w:spacing w:after="0" w:line="276" w:lineRule="auto"/>
-        <w:rPr>
-          <w:rFonts w:ascii="Cambria" w:hAnsi="Cambria"/>
-        </w:rPr>
-      </w:pPr>
-    </w:p>
-    <w:p>
-      <w:pPr>
-        <w:spacing w:after="0" w:line="276" w:lineRule="auto"/>
-        <w:rPr>
-          <w:rFonts w:ascii="Cambria" w:hAnsi="Cambria"/>
-        </w:rPr>
-      </w:pPr>
-    </w:p>
-    <w:p>
-      <w:pPr>
-        <w:spacing w:after="0" w:line="276" w:lineRule="auto"/>
-        <w:rPr>
-          <w:rFonts w:ascii="Cambria" w:hAnsi="Cambria"/>
-        </w:rPr>
-      </w:pPr>
-    </w:p>
-    <w:p>
-      <w:pPr>
-        <w:spacing w:after="0" w:line="276" w:lineRule="auto"/>
-        <w:rPr>
-          <w:rFonts w:ascii="Cambria" w:hAnsi="Cambria"/>
-        </w:rPr>
-      </w:pPr>
-    </w:p>
-    <w:p>
-      <w:pPr>
-        <w:spacing w:after="0" w:line="276" w:lineRule="auto"/>
-        <w:rPr>
-          <w:rFonts w:ascii="Cambria" w:hAnsi="Cambria"/>
-        </w:rPr>
-      </w:pPr>
-    </w:p>
-    <w:p>
-      <w:pPr>
-        <w:spacing w:after="0" w:line="276" w:lineRule="auto"/>
-        <w:rPr>
-          <w:rFonts w:ascii="Cambria" w:hAnsi="Cambria"/>
-        </w:rPr>
-      </w:pPr>
-    </w:p>
-    <w:p>
-      <w:pPr>
-        <w:spacing w:after="0" w:line="276" w:lineRule="auto"/>
-        <w:rPr>
-          <w:rFonts w:ascii="Cambria" w:hAnsi="Cambria"/>
-        </w:rPr>
-      </w:pPr>
-    </w:p>
-    <w:p>
-      <w:pPr>
-        <w:spacing w:after="0" w:line="276" w:lineRule="auto"/>
-        <w:rPr>
-          <w:rFonts w:ascii="Cambria" w:hAnsi="Cambria"/>
-        </w:rPr>
-      </w:pPr>
-    </w:p>
-    <w:p>
-      <w:pPr>
-        <w:spacing w:after="0" w:line="276" w:lineRule="auto"/>
+        <w:t>[Your Position]</w:t>
+      </w:r>
+    </w:p>
+    <w:p>
+      <w:pPr>
+        <w:spacing w:line="276" w:lineRule="auto"/>
         <w:rPr>
           <w:rFonts w:ascii="Cambria" w:hAnsi="Cambria"/>
         </w:rPr>
       </w:pPr>
     </w:p>
     <w:sectPr>
-      <w:headerReference w:type="default" r:id="rId6"/>
-      <w:footerReference w:type="default" r:id="rId7"/>
+      <w:headerReference w:type="even" r:id="rId6"/>
+      <w:headerReference w:type="default" r:id="rId7"/>
+      <w:footerReference w:type="even" r:id="rId8"/>
+      <w:footerReference w:type="default" r:id="rId9"/>
+      <w:headerReference w:type="first" r:id="rId10"/>
+      <w:footerReference w:type="first" r:id="rId11"/>
       <w:pgSz w:w="12240" w:h="18720" w:code="14"/>
       <w:pgMar w:top="720" w:right="720" w:bottom="720" w:left="720" w:header="720" w:footer="720" w:gutter="0"/>
       <w:cols w:space="720"/>
@@ -445,15 +730,28 @@
     <w:pPr>
       <w:pStyle w:val="Footer"/>
     </w:pPr>
+  </w:p>
+</w:ftr>
+</file>
+
+<file path=word/footer2.xml><?xml version="1.0" encoding="utf-8"?>
+<w:ftr xmlns:wpc="http://schemas.microsoft.com/office/word/2010/wordprocessingCanvas" xmlns:cx="http://schemas.microsoft.com/office/drawing/2014/chartex" xmlns:cx1="http://schemas.microsoft.com/office/drawing/2015/9/8/chartex" xmlns:cx2="http://schemas.microsoft.com/office/drawing/2015/10/21/chartex" xmlns:cx3="http://schemas.microsoft.com/office/drawing/2016/5/9/chartex" xmlns:cx4="http://schemas.microsoft.com/office/drawing/2016/5/10/chartex" xmlns:cx5="http://schemas.microsoft.com/office/drawing/2016/5/11/chartex" xmlns:cx6="http://schemas.microsoft.com/office/drawing/2016/5/12/chartex" xmlns:cx7="http://schemas.microsoft.com/office/drawing/2016/5/13/chartex" xmlns:cx8="http://schemas.microsoft.com/office/drawing/2016/5/14/chartex" xmlns:mc="http://schemas.openxmlformats.org/markup-compatibility/2006" xmlns:aink="http://schemas.microsoft.com/office/drawing/2016/ink" xmlns:am3d="http://schemas.microsoft.com/office/drawing/2017/model3d" xmlns:o="urn:schemas-microsoft-com:office:office" xmlns:oel="http://schemas.microsoft.com/office/2019/extlst" xmlns:r="http://schemas.openxmlformats.org/officeDocument/2006/relationships" xmlns:m="http://schemas.openxmlformats.org/officeDocument/2006/math" xmlns:v="urn:schemas-microsoft-com:vml" xmlns:wp14="http://schemas.microsoft.com/office/word/2010/wordprocessingDrawing" xmlns:wp="http://schemas.openxmlformats.org/drawingml/2006/wordprocessingDrawing" xmlns:w10="urn:schemas-microsoft-com:office:word" xmlns:w="http://schemas.openxmlformats.org/wordprocessingml/2006/main" xmlns:w14="http://schemas.microsoft.com/office/word/2010/wordml" xmlns:w15="http://schemas.microsoft.com/office/word/2012/wordml" xmlns:w16cex="http://schemas.microsoft.com/office/word/2018/wordml/cex" xmlns:w16cid="http://schemas.microsoft.com/office/word/2016/wordml/cid" xmlns:w16="http://schemas.microsoft.com/office/word/2018/wordml" xmlns:w16du="http://schemas.microsoft.com/office/word/2023/wordml/word16du" xmlns:w16sdtdh="http://schemas.microsoft.com/office/word/2020/wordml/sdtdatahash" xmlns:w16sdtfl="http://schemas.microsoft.com/office/word/2024/wordml/sdtformatlock" xmlns:w16se="http://schemas.microsoft.com/office/word/2015/wordml/symex" xmlns:wpg="http://schemas.microsoft.com/office/word/2010/wordprocessingGroup" xmlns:wpi="http://schemas.microsoft.com/office/word/2010/wordprocessingInk" xmlns:wne="http://schemas.microsoft.com/office/word/2006/wordml" xmlns:wps="http://schemas.microsoft.com/office/word/2010/wordprocessingShape" mc:Ignorable="w14 w15 w16se w16cid w16 w16cex w16sdtdh w16sdtfl w16du wp14">
+  <w:p>
+    <w:pPr>
+      <w:pStyle w:val="Footer"/>
+    </w:pPr>
     <w:r>
+      <w:rPr>
+        <w:noProof/>
+      </w:rPr>
       <w:drawing>
-        <wp:anchor distT="0" distB="0" distL="114300" distR="114300" simplePos="0" relativeHeight="251659264" behindDoc="0" locked="0" layoutInCell="1" allowOverlap="1" wp14:anchorId="6C1193F8" wp14:editId="2D5F74E6">
+        <wp:anchor distT="0" distB="0" distL="114300" distR="114300" simplePos="0" relativeHeight="251663360" behindDoc="0" locked="0" layoutInCell="1" allowOverlap="1" wp14:anchorId="4511F7B9" wp14:editId="6007E273">
           <wp:simplePos x="0" y="0"/>
           <wp:positionH relativeFrom="page">
             <wp:align>right</wp:align>
           </wp:positionH>
           <wp:positionV relativeFrom="paragraph">
-            <wp:posOffset>-22261</wp:posOffset>
+            <wp:posOffset>-10633</wp:posOffset>
           </wp:positionV>
           <wp:extent cx="7772400" cy="1576070"/>
           <wp:effectExtent l="0" t="0" r="0" b="5080"/>
@@ -531,6 +829,16 @@
 </w:ftr>
 </file>
 
+<file path=word/footer3.xml><?xml version="1.0" encoding="utf-8"?>
+<w:ftr xmlns:wpc="http://schemas.microsoft.com/office/word/2010/wordprocessingCanvas" xmlns:cx="http://schemas.microsoft.com/office/drawing/2014/chartex" xmlns:cx1="http://schemas.microsoft.com/office/drawing/2015/9/8/chartex" xmlns:cx2="http://schemas.microsoft.com/office/drawing/2015/10/21/chartex" xmlns:cx3="http://schemas.microsoft.com/office/drawing/2016/5/9/chartex" xmlns:cx4="http://schemas.microsoft.com/office/drawing/2016/5/10/chartex" xmlns:cx5="http://schemas.microsoft.com/office/drawing/2016/5/11/chartex" xmlns:cx6="http://schemas.microsoft.com/office/drawing/2016/5/12/chartex" xmlns:cx7="http://schemas.microsoft.com/office/drawing/2016/5/13/chartex" xmlns:cx8="http://schemas.microsoft.com/office/drawing/2016/5/14/chartex" xmlns:mc="http://schemas.openxmlformats.org/markup-compatibility/2006" xmlns:aink="http://schemas.microsoft.com/office/drawing/2016/ink" xmlns:am3d="http://schemas.microsoft.com/office/drawing/2017/model3d" xmlns:o="urn:schemas-microsoft-com:office:office" xmlns:oel="http://schemas.microsoft.com/office/2019/extlst" xmlns:r="http://schemas.openxmlformats.org/officeDocument/2006/relationships" xmlns:m="http://schemas.openxmlformats.org/officeDocument/2006/math" xmlns:v="urn:schemas-microsoft-com:vml" xmlns:wp14="http://schemas.microsoft.com/office/word/2010/wordprocessingDrawing" xmlns:wp="http://schemas.openxmlformats.org/drawingml/2006/wordprocessingDrawing" xmlns:w10="urn:schemas-microsoft-com:office:word" xmlns:w="http://schemas.openxmlformats.org/wordprocessingml/2006/main" xmlns:w14="http://schemas.microsoft.com/office/word/2010/wordml" xmlns:w15="http://schemas.microsoft.com/office/word/2012/wordml" xmlns:w16cex="http://schemas.microsoft.com/office/word/2018/wordml/cex" xmlns:w16cid="http://schemas.microsoft.com/office/word/2016/wordml/cid" xmlns:w16="http://schemas.microsoft.com/office/word/2018/wordml" xmlns:w16du="http://schemas.microsoft.com/office/word/2023/wordml/word16du" xmlns:w16sdtdh="http://schemas.microsoft.com/office/word/2020/wordml/sdtdatahash" xmlns:w16sdtfl="http://schemas.microsoft.com/office/word/2024/wordml/sdtformatlock" xmlns:w16se="http://schemas.microsoft.com/office/word/2015/wordml/symex" xmlns:wpg="http://schemas.microsoft.com/office/word/2010/wordprocessingGroup" xmlns:wpi="http://schemas.microsoft.com/office/word/2010/wordprocessingInk" xmlns:wne="http://schemas.microsoft.com/office/word/2006/wordml" xmlns:wps="http://schemas.microsoft.com/office/word/2010/wordprocessingShape" mc:Ignorable="w14 w15 w16se w16cid w16 w16cex w16sdtdh w16sdtfl w16du wp14">
+  <w:p>
+    <w:pPr>
+      <w:pStyle w:val="Footer"/>
+    </w:pPr>
+  </w:p>
+</w:ftr>
+</file>
+
 <file path=word/footnotes.xml><?xml version="1.0" encoding="utf-8"?>
 <w:footnotes xmlns:wpc="http://schemas.microsoft.com/office/word/2010/wordprocessingCanvas" xmlns:cx="http://schemas.microsoft.com/office/drawing/2014/chartex" xmlns:cx1="http://schemas.microsoft.com/office/drawing/2015/9/8/chartex" xmlns:cx2="http://schemas.microsoft.com/office/drawing/2015/10/21/chartex" xmlns:cx3="http://schemas.microsoft.com/office/drawing/2016/5/9/chartex" xmlns:cx4="http://schemas.microsoft.com/office/drawing/2016/5/10/chartex" xmlns:cx5="http://schemas.microsoft.com/office/drawing/2016/5/11/chartex" xmlns:cx6="http://schemas.microsoft.com/office/drawing/2016/5/12/chartex" xmlns:cx7="http://schemas.microsoft.com/office/drawing/2016/5/13/chartex" xmlns:cx8="http://schemas.microsoft.com/office/drawing/2016/5/14/chartex" xmlns:mc="http://schemas.openxmlformats.org/markup-compatibility/2006" xmlns:aink="http://schemas.microsoft.com/office/drawing/2016/ink" xmlns:am3d="http://schemas.microsoft.com/office/drawing/2017/model3d" xmlns:o="urn:schemas-microsoft-com:office:office" xmlns:oel="http://schemas.microsoft.com/office/2019/extlst" xmlns:r="http://schemas.openxmlformats.org/officeDocument/2006/relationships" xmlns:m="http://schemas.openxmlformats.org/officeDocument/2006/math" xmlns:v="urn:schemas-microsoft-com:vml" xmlns:wp14="http://schemas.microsoft.com/office/word/2010/wordprocessingDrawing" xmlns:wp="http://schemas.openxmlformats.org/drawingml/2006/wordprocessingDrawing" xmlns:w10="urn:schemas-microsoft-com:office:word" xmlns:w="http://schemas.openxmlformats.org/wordprocessingml/2006/main" xmlns:w14="http://schemas.microsoft.com/office/word/2010/wordml" xmlns:w15="http://schemas.microsoft.com/office/word/2012/wordml" xmlns:w16cex="http://schemas.microsoft.com/office/word/2018/wordml/cex" xmlns:w16cid="http://schemas.microsoft.com/office/word/2016/wordml/cid" xmlns:w16="http://schemas.microsoft.com/office/word/2018/wordml" xmlns:w16du="http://schemas.microsoft.com/office/word/2023/wordml/word16du" xmlns:w16sdtdh="http://schemas.microsoft.com/office/word/2020/wordml/sdtdatahash" xmlns:w16sdtfl="http://schemas.microsoft.com/office/word/2024/wordml/sdtformatlock" xmlns:w16se="http://schemas.microsoft.com/office/word/2015/wordml/symex" xmlns:wpg="http://schemas.microsoft.com/office/word/2010/wordprocessingGroup" xmlns:wpi="http://schemas.microsoft.com/office/word/2010/wordprocessingInk" xmlns:wne="http://schemas.microsoft.com/office/word/2006/wordml" xmlns:wps="http://schemas.microsoft.com/office/word/2010/wordprocessingShape" mc:Ignorable="w14 w15 w16se w16cid w16 w16cex w16sdtdh w16sdtfl w16du wp14">
   <w:footnote w:type="separator" w:id="-1">
@@ -562,18 +870,31 @@
     <w:pPr>
       <w:pStyle w:val="Header"/>
     </w:pPr>
+  </w:p>
+</w:hdr>
+</file>
+
+<file path=word/header2.xml><?xml version="1.0" encoding="utf-8"?>
+<w:hdr xmlns:wpc="http://schemas.microsoft.com/office/word/2010/wordprocessingCanvas" xmlns:cx="http://schemas.microsoft.com/office/drawing/2014/chartex" xmlns:cx1="http://schemas.microsoft.com/office/drawing/2015/9/8/chartex" xmlns:cx2="http://schemas.microsoft.com/office/drawing/2015/10/21/chartex" xmlns:cx3="http://schemas.microsoft.com/office/drawing/2016/5/9/chartex" xmlns:cx4="http://schemas.microsoft.com/office/drawing/2016/5/10/chartex" xmlns:cx5="http://schemas.microsoft.com/office/drawing/2016/5/11/chartex" xmlns:cx6="http://schemas.microsoft.com/office/drawing/2016/5/12/chartex" xmlns:cx7="http://schemas.microsoft.com/office/drawing/2016/5/13/chartex" xmlns:cx8="http://schemas.microsoft.com/office/drawing/2016/5/14/chartex" xmlns:mc="http://schemas.openxmlformats.org/markup-compatibility/2006" xmlns:aink="http://schemas.microsoft.com/office/drawing/2016/ink" xmlns:am3d="http://schemas.microsoft.com/office/drawing/2017/model3d" xmlns:o="urn:schemas-microsoft-com:office:office" xmlns:oel="http://schemas.microsoft.com/office/2019/extlst" xmlns:r="http://schemas.openxmlformats.org/officeDocument/2006/relationships" xmlns:m="http://schemas.openxmlformats.org/officeDocument/2006/math" xmlns:v="urn:schemas-microsoft-com:vml" xmlns:wp14="http://schemas.microsoft.com/office/word/2010/wordprocessingDrawing" xmlns:wp="http://schemas.openxmlformats.org/drawingml/2006/wordprocessingDrawing" xmlns:w10="urn:schemas-microsoft-com:office:word" xmlns:w="http://schemas.openxmlformats.org/wordprocessingml/2006/main" xmlns:w14="http://schemas.microsoft.com/office/word/2010/wordml" xmlns:w15="http://schemas.microsoft.com/office/word/2012/wordml" xmlns:w16cex="http://schemas.microsoft.com/office/word/2018/wordml/cex" xmlns:w16cid="http://schemas.microsoft.com/office/word/2016/wordml/cid" xmlns:w16="http://schemas.microsoft.com/office/word/2018/wordml" xmlns:w16du="http://schemas.microsoft.com/office/word/2023/wordml/word16du" xmlns:w16sdtdh="http://schemas.microsoft.com/office/word/2020/wordml/sdtdatahash" xmlns:w16sdtfl="http://schemas.microsoft.com/office/word/2024/wordml/sdtformatlock" xmlns:w16se="http://schemas.microsoft.com/office/word/2015/wordml/symex" xmlns:wpg="http://schemas.microsoft.com/office/word/2010/wordprocessingGroup" xmlns:wpi="http://schemas.microsoft.com/office/word/2010/wordprocessingInk" xmlns:wne="http://schemas.microsoft.com/office/word/2006/wordml" xmlns:wps="http://schemas.microsoft.com/office/word/2010/wordprocessingShape" mc:Ignorable="w14 w15 w16se w16cid w16 w16cex w16sdtdh w16sdtfl w16du wp14">
+  <w:p>
+    <w:pPr>
+      <w:pStyle w:val="Header"/>
+      <w:rPr>
+        <w:noProof/>
+      </w:rPr>
+    </w:pPr>
     <w:r>
       <w:rPr>
         <w:noProof/>
       </w:rPr>
       <w:drawing>
-        <wp:anchor distT="0" distB="0" distL="114300" distR="114300" simplePos="0" relativeHeight="251658240" behindDoc="0" locked="0" layoutInCell="1" allowOverlap="1" wp14:anchorId="01FD9C50" wp14:editId="5514C52A">
+        <wp:anchor distT="0" distB="0" distL="114300" distR="114300" simplePos="0" relativeHeight="251661312" behindDoc="0" locked="0" layoutInCell="1" allowOverlap="1" wp14:anchorId="4461BCCF" wp14:editId="03B5A60D">
           <wp:simplePos x="0" y="0"/>
           <wp:positionH relativeFrom="page">
             <wp:align>right</wp:align>
           </wp:positionH>
           <wp:positionV relativeFrom="paragraph">
-            <wp:posOffset>-448310</wp:posOffset>
+            <wp:posOffset>-457200</wp:posOffset>
           </wp:positionV>
           <wp:extent cx="7797429" cy="1371600"/>
           <wp:effectExtent l="0" t="0" r="0" b="0"/>
@@ -633,6 +954,9 @@
   <w:p>
     <w:pPr>
       <w:pStyle w:val="Header"/>
+      <w:rPr>
+        <w:noProof/>
+      </w:rPr>
     </w:pPr>
   </w:p>
   <w:p>
@@ -645,6 +969,16 @@
       <w:pStyle w:val="Header"/>
     </w:pPr>
   </w:p>
+  <w:p>
+    <w:pPr>
+      <w:pStyle w:val="Header"/>
+    </w:pPr>
+  </w:p>
+</w:hdr>
+</file>
+
+<file path=word/header3.xml><?xml version="1.0" encoding="utf-8"?>
+<w:hdr xmlns:wpc="http://schemas.microsoft.com/office/word/2010/wordprocessingCanvas" xmlns:cx="http://schemas.microsoft.com/office/drawing/2014/chartex" xmlns:cx1="http://schemas.microsoft.com/office/drawing/2015/9/8/chartex" xmlns:cx2="http://schemas.microsoft.com/office/drawing/2015/10/21/chartex" xmlns:cx3="http://schemas.microsoft.com/office/drawing/2016/5/9/chartex" xmlns:cx4="http://schemas.microsoft.com/office/drawing/2016/5/10/chartex" xmlns:cx5="http://schemas.microsoft.com/office/drawing/2016/5/11/chartex" xmlns:cx6="http://schemas.microsoft.com/office/drawing/2016/5/12/chartex" xmlns:cx7="http://schemas.microsoft.com/office/drawing/2016/5/13/chartex" xmlns:cx8="http://schemas.microsoft.com/office/drawing/2016/5/14/chartex" xmlns:mc="http://schemas.openxmlformats.org/markup-compatibility/2006" xmlns:aink="http://schemas.microsoft.com/office/drawing/2016/ink" xmlns:am3d="http://schemas.microsoft.com/office/drawing/2017/model3d" xmlns:o="urn:schemas-microsoft-com:office:office" xmlns:oel="http://schemas.microsoft.com/office/2019/extlst" xmlns:r="http://schemas.openxmlformats.org/officeDocument/2006/relationships" xmlns:m="http://schemas.openxmlformats.org/officeDocument/2006/math" xmlns:v="urn:schemas-microsoft-com:vml" xmlns:wp14="http://schemas.microsoft.com/office/word/2010/wordprocessingDrawing" xmlns:wp="http://schemas.openxmlformats.org/drawingml/2006/wordprocessingDrawing" xmlns:w10="urn:schemas-microsoft-com:office:word" xmlns:w="http://schemas.openxmlformats.org/wordprocessingml/2006/main" xmlns:w14="http://schemas.microsoft.com/office/word/2010/wordml" xmlns:w15="http://schemas.microsoft.com/office/word/2012/wordml" xmlns:w16cex="http://schemas.microsoft.com/office/word/2018/wordml/cex" xmlns:w16cid="http://schemas.microsoft.com/office/word/2016/wordml/cid" xmlns:w16="http://schemas.microsoft.com/office/word/2018/wordml" xmlns:w16du="http://schemas.microsoft.com/office/word/2023/wordml/word16du" xmlns:w16sdtdh="http://schemas.microsoft.com/office/word/2020/wordml/sdtdatahash" xmlns:w16sdtfl="http://schemas.microsoft.com/office/word/2024/wordml/sdtformatlock" xmlns:w16se="http://schemas.microsoft.com/office/word/2015/wordml/symex" xmlns:wpg="http://schemas.microsoft.com/office/word/2010/wordprocessingGroup" xmlns:wpi="http://schemas.microsoft.com/office/word/2010/wordprocessingInk" xmlns:wne="http://schemas.microsoft.com/office/word/2006/wordml" xmlns:wps="http://schemas.microsoft.com/office/word/2010/wordprocessingShape" mc:Ignorable="w14 w15 w16se w16cid w16 w16cex w16sdtdh w16sdtfl w16du wp14">
   <w:p>
     <w:pPr>
       <w:pStyle w:val="Header"/>
@@ -1053,6 +1387,7 @@
   <w:style w:type="paragraph" w:default="1" w:styleId="Normal">
     <w:name w:val="Normal"/>
     <w:qFormat/>
+    <w:rsid w:val="00771E81"/>
   </w:style>
   <w:style w:type="paragraph" w:styleId="Heading1">
     <w:name w:val="heading 1"/>
@@ -1061,7 +1396,7 @@
     <w:link w:val="Heading1Char"/>
     <w:uiPriority w:val="9"/>
     <w:qFormat/>
-    <w:rsid w:val="00384908"/>
+    <w:rsid w:val="00F23FC6"/>
     <w:pPr>
       <w:keepNext/>
       <w:keepLines/>
@@ -1084,7 +1419,7 @@
     <w:semiHidden/>
     <w:unhideWhenUsed/>
     <w:qFormat/>
-    <w:rsid w:val="00384908"/>
+    <w:rsid w:val="00F23FC6"/>
     <w:pPr>
       <w:keepNext/>
       <w:keepLines/>
@@ -1107,7 +1442,7 @@
     <w:semiHidden/>
     <w:unhideWhenUsed/>
     <w:qFormat/>
-    <w:rsid w:val="00384908"/>
+    <w:rsid w:val="00F23FC6"/>
     <w:pPr>
       <w:keepNext/>
       <w:keepLines/>
@@ -1130,7 +1465,7 @@
     <w:semiHidden/>
     <w:unhideWhenUsed/>
     <w:qFormat/>
-    <w:rsid w:val="00384908"/>
+    <w:rsid w:val="00F23FC6"/>
     <w:pPr>
       <w:keepNext/>
       <w:keepLines/>
@@ -1153,7 +1488,7 @@
     <w:semiHidden/>
     <w:unhideWhenUsed/>
     <w:qFormat/>
-    <w:rsid w:val="00384908"/>
+    <w:rsid w:val="00F23FC6"/>
     <w:pPr>
       <w:keepNext/>
       <w:keepLines/>
@@ -1174,7 +1509,7 @@
     <w:semiHidden/>
     <w:unhideWhenUsed/>
     <w:qFormat/>
-    <w:rsid w:val="00384908"/>
+    <w:rsid w:val="00F23FC6"/>
     <w:pPr>
       <w:keepNext/>
       <w:keepLines/>
@@ -1197,7 +1532,7 @@
     <w:semiHidden/>
     <w:unhideWhenUsed/>
     <w:qFormat/>
-    <w:rsid w:val="00384908"/>
+    <w:rsid w:val="00F23FC6"/>
     <w:pPr>
       <w:keepNext/>
       <w:keepLines/>
@@ -1218,7 +1553,7 @@
     <w:semiHidden/>
     <w:unhideWhenUsed/>
     <w:qFormat/>
-    <w:rsid w:val="00384908"/>
+    <w:rsid w:val="00F23FC6"/>
     <w:pPr>
       <w:keepNext/>
       <w:keepLines/>
@@ -1241,7 +1576,7 @@
     <w:semiHidden/>
     <w:unhideWhenUsed/>
     <w:qFormat/>
-    <w:rsid w:val="00384908"/>
+    <w:rsid w:val="00F23FC6"/>
     <w:pPr>
       <w:keepNext/>
       <w:keepLines/>
@@ -1256,6 +1591,7 @@
   <w:style w:type="character" w:default="1" w:styleId="DefaultParagraphFont">
     <w:name w:val="Default Paragraph Font"/>
     <w:uiPriority w:val="1"/>
+    <w:semiHidden/>
     <w:unhideWhenUsed/>
   </w:style>
   <w:style w:type="table" w:default="1" w:styleId="TableNormal">
@@ -1284,7 +1620,7 @@
     <w:basedOn w:val="DefaultParagraphFont"/>
     <w:link w:val="Heading1"/>
     <w:uiPriority w:val="9"/>
-    <w:rsid w:val="00384908"/>
+    <w:rsid w:val="00F23FC6"/>
     <w:rPr>
       <w:rFonts w:asciiTheme="majorHAnsi" w:eastAsiaTheme="majorEastAsia" w:hAnsiTheme="majorHAnsi" w:cstheme="majorBidi"/>
       <w:color w:val="0F4761" w:themeColor="accent1" w:themeShade="BF"/>
@@ -1298,7 +1634,7 @@
     <w:link w:val="Heading2"/>
     <w:uiPriority w:val="9"/>
     <w:semiHidden/>
-    <w:rsid w:val="00384908"/>
+    <w:rsid w:val="00F23FC6"/>
     <w:rPr>
       <w:rFonts w:asciiTheme="majorHAnsi" w:eastAsiaTheme="majorEastAsia" w:hAnsiTheme="majorHAnsi" w:cstheme="majorBidi"/>
       <w:color w:val="0F4761" w:themeColor="accent1" w:themeShade="BF"/>
@@ -1312,7 +1648,7 @@
     <w:link w:val="Heading3"/>
     <w:uiPriority w:val="9"/>
     <w:semiHidden/>
-    <w:rsid w:val="00384908"/>
+    <w:rsid w:val="00F23FC6"/>
     <w:rPr>
       <w:rFonts w:eastAsiaTheme="majorEastAsia" w:cstheme="majorBidi"/>
       <w:color w:val="0F4761" w:themeColor="accent1" w:themeShade="BF"/>
@@ -1326,7 +1662,7 @@
     <w:link w:val="Heading4"/>
     <w:uiPriority w:val="9"/>
     <w:semiHidden/>
-    <w:rsid w:val="00384908"/>
+    <w:rsid w:val="00F23FC6"/>
     <w:rPr>
       <w:rFonts w:eastAsiaTheme="majorEastAsia" w:cstheme="majorBidi"/>
       <w:i/>
@@ -1340,7 +1676,7 @@
     <w:link w:val="Heading5"/>
     <w:uiPriority w:val="9"/>
     <w:semiHidden/>
-    <w:rsid w:val="00384908"/>
+    <w:rsid w:val="00F23FC6"/>
     <w:rPr>
       <w:rFonts w:eastAsiaTheme="majorEastAsia" w:cstheme="majorBidi"/>
       <w:color w:val="0F4761" w:themeColor="accent1" w:themeShade="BF"/>
@@ -1352,7 +1688,7 @@
     <w:link w:val="Heading6"/>
     <w:uiPriority w:val="9"/>
     <w:semiHidden/>
-    <w:rsid w:val="00384908"/>
+    <w:rsid w:val="00F23FC6"/>
     <w:rPr>
       <w:rFonts w:eastAsiaTheme="majorEastAsia" w:cstheme="majorBidi"/>
       <w:i/>
@@ -1366,7 +1702,7 @@
     <w:link w:val="Heading7"/>
     <w:uiPriority w:val="9"/>
     <w:semiHidden/>
-    <w:rsid w:val="00384908"/>
+    <w:rsid w:val="00F23FC6"/>
     <w:rPr>
       <w:rFonts w:eastAsiaTheme="majorEastAsia" w:cstheme="majorBidi"/>
       <w:color w:val="595959" w:themeColor="text1" w:themeTint="A6"/>
@@ -1378,7 +1714,7 @@
     <w:link w:val="Heading8"/>
     <w:uiPriority w:val="9"/>
     <w:semiHidden/>
-    <w:rsid w:val="00384908"/>
+    <w:rsid w:val="00F23FC6"/>
     <w:rPr>
       <w:rFonts w:eastAsiaTheme="majorEastAsia" w:cstheme="majorBidi"/>
       <w:i/>
@@ -1392,7 +1728,7 @@
     <w:link w:val="Heading9"/>
     <w:uiPriority w:val="9"/>
     <w:semiHidden/>
-    <w:rsid w:val="00384908"/>
+    <w:rsid w:val="00F23FC6"/>
     <w:rPr>
       <w:rFonts w:eastAsiaTheme="majorEastAsia" w:cstheme="majorBidi"/>
       <w:color w:val="272727" w:themeColor="text1" w:themeTint="D8"/>
@@ -1405,7 +1741,7 @@
     <w:link w:val="TitleChar"/>
     <w:uiPriority w:val="10"/>
     <w:qFormat/>
-    <w:rsid w:val="00384908"/>
+    <w:rsid w:val="00F23FC6"/>
     <w:pPr>
       <w:spacing w:after="80" w:line="240" w:lineRule="auto"/>
       <w:contextualSpacing/>
@@ -1423,7 +1759,7 @@
     <w:basedOn w:val="DefaultParagraphFont"/>
     <w:link w:val="Title"/>
     <w:uiPriority w:val="10"/>
-    <w:rsid w:val="00384908"/>
+    <w:rsid w:val="00F23FC6"/>
     <w:rPr>
       <w:rFonts w:asciiTheme="majorHAnsi" w:eastAsiaTheme="majorEastAsia" w:hAnsiTheme="majorHAnsi" w:cstheme="majorBidi"/>
       <w:spacing w:val="-10"/>
@@ -1439,7 +1775,7 @@
     <w:link w:val="SubtitleChar"/>
     <w:uiPriority w:val="11"/>
     <w:qFormat/>
-    <w:rsid w:val="00384908"/>
+    <w:rsid w:val="00F23FC6"/>
     <w:pPr>
       <w:numPr>
         <w:ilvl w:val="1"/>
@@ -1458,7 +1794,7 @@
     <w:basedOn w:val="DefaultParagraphFont"/>
     <w:link w:val="Subtitle"/>
     <w:uiPriority w:val="11"/>
-    <w:rsid w:val="00384908"/>
+    <w:rsid w:val="00F23FC6"/>
     <w:rPr>
       <w:rFonts w:eastAsiaTheme="majorEastAsia" w:cstheme="majorBidi"/>
       <w:color w:val="595959" w:themeColor="text1" w:themeTint="A6"/>
@@ -1474,7 +1810,7 @@
     <w:link w:val="QuoteChar"/>
     <w:uiPriority w:val="29"/>
     <w:qFormat/>
-    <w:rsid w:val="00384908"/>
+    <w:rsid w:val="00F23FC6"/>
     <w:pPr>
       <w:spacing w:before="160"/>
       <w:jc w:val="center"/>
@@ -1490,7 +1826,7 @@
     <w:basedOn w:val="DefaultParagraphFont"/>
     <w:link w:val="Quote"/>
     <w:uiPriority w:val="29"/>
-    <w:rsid w:val="00384908"/>
+    <w:rsid w:val="00F23FC6"/>
     <w:rPr>
       <w:i/>
       <w:iCs/>
@@ -1502,7 +1838,7 @@
     <w:basedOn w:val="Normal"/>
     <w:uiPriority w:val="34"/>
     <w:qFormat/>
-    <w:rsid w:val="00384908"/>
+    <w:rsid w:val="00F23FC6"/>
     <w:pPr>
       <w:ind w:left="720"/>
       <w:contextualSpacing/>
@@ -1513,7 +1849,7 @@
     <w:basedOn w:val="DefaultParagraphFont"/>
     <w:uiPriority w:val="21"/>
     <w:qFormat/>
-    <w:rsid w:val="00384908"/>
+    <w:rsid w:val="00F23FC6"/>
     <w:rPr>
       <w:i/>
       <w:iCs/>
@@ -1527,7 +1863,7 @@
     <w:link w:val="IntenseQuoteChar"/>
     <w:uiPriority w:val="30"/>
     <w:qFormat/>
-    <w:rsid w:val="00384908"/>
+    <w:rsid w:val="00F23FC6"/>
     <w:pPr>
       <w:pBdr>
         <w:top w:val="single" w:sz="4" w:space="10" w:color="0F4761" w:themeColor="accent1" w:themeShade="BF"/>
@@ -1548,7 +1884,7 @@
     <w:basedOn w:val="DefaultParagraphFont"/>
     <w:link w:val="IntenseQuote"/>
     <w:uiPriority w:val="30"/>
-    <w:rsid w:val="00384908"/>
+    <w:rsid w:val="00F23FC6"/>
     <w:rPr>
       <w:i/>
       <w:iCs/>
@@ -1560,7 +1896,7 @@
     <w:basedOn w:val="DefaultParagraphFont"/>
     <w:uiPriority w:val="32"/>
     <w:qFormat/>
-    <w:rsid w:val="00384908"/>
+    <w:rsid w:val="00F23FC6"/>
     <w:rPr>
       <w:b/>
       <w:bCs/>
@@ -1575,7 +1911,7 @@
     <w:link w:val="HeaderChar"/>
     <w:uiPriority w:val="99"/>
     <w:unhideWhenUsed/>
-    <w:rsid w:val="00384908"/>
+    <w:rsid w:val="00F23FC6"/>
     <w:pPr>
       <w:tabs>
         <w:tab w:val="center" w:pos="4680"/>
@@ -1589,7 +1925,7 @@
     <w:basedOn w:val="DefaultParagraphFont"/>
     <w:link w:val="Header"/>
     <w:uiPriority w:val="99"/>
-    <w:rsid w:val="00384908"/>
+    <w:rsid w:val="00F23FC6"/>
   </w:style>
   <w:style w:type="paragraph" w:styleId="Footer">
     <w:name w:val="footer"/>
@@ -1597,7 +1933,7 @@
     <w:link w:val="FooterChar"/>
     <w:uiPriority w:val="99"/>
     <w:unhideWhenUsed/>
-    <w:rsid w:val="00384908"/>
+    <w:rsid w:val="00F23FC6"/>
     <w:pPr>
       <w:tabs>
         <w:tab w:val="center" w:pos="4680"/>
@@ -1611,30 +1947,7 @@
     <w:basedOn w:val="DefaultParagraphFont"/>
     <w:link w:val="Footer"/>
     <w:uiPriority w:val="99"/>
-    <w:rsid w:val="00384908"/>
-  </w:style>
-  <w:style w:type="character" w:styleId="Hyperlink">
-    <w:name w:val="Hyperlink"/>
-    <w:basedOn w:val="DefaultParagraphFont"/>
-    <w:uiPriority w:val="99"/>
-    <w:unhideWhenUsed/>
-    <w:rsid w:val="00FF41C8"/>
-    <w:rPr>
-      <w:color w:val="467886" w:themeColor="hyperlink"/>
-      <w:u w:val="single"/>
-    </w:rPr>
-  </w:style>
-  <w:style w:type="character" w:styleId="UnresolvedMention">
-    <w:name w:val="Unresolved Mention"/>
-    <w:basedOn w:val="DefaultParagraphFont"/>
-    <w:uiPriority w:val="99"/>
-    <w:semiHidden/>
-    <w:unhideWhenUsed/>
-    <w:rsid w:val="00FF41C8"/>
-    <w:rPr>
-      <w:color w:val="605E5C"/>
-      <w:shd w:val="clear" w:color="auto" w:fill="E1DFDD"/>
-    </w:rPr>
+    <w:rsid w:val="00F23FC6"/>
   </w:style>
 </w:styles>
 </file>
@@ -1944,6 +2257,21 @@
         </a:fontRef>
       </a:style>
     </a:lnDef>
+    <a:txDef>
+      <a:spPr bwMode="auto">
+        <a:noFill/>
+        <a:ln w="9525">
+          <a:noFill/>
+          <a:miter lim="800000"/>
+          <a:headEnd/>
+          <a:tailEnd/>
+        </a:ln>
+      </a:spPr>
+      <a:bodyPr rot="0" vert="horz" wrap="square" lIns="91440" tIns="45720" rIns="91440" bIns="45720" anchor="t" anchorCtr="0">
+        <a:spAutoFit/>
+      </a:bodyPr>
+      <a:lstStyle/>
+    </a:txDef>
   </a:objectDefaults>
   <a:extraClrSchemeLst/>
   <a:extLst>

</xml_diff>